<commit_message>
Control-law memo v2: OCXO-A/B -> OCXO-1/2; add "what is a transfer function"
- Relabel oscillators OCXO-1 (reference) / OCXO-2 (controlled) in fig1, fig2, text.
- Add a beginner gloss for the transfer function G(s): input->output rule
  (output = G(s) x input), s = differentiate/integrate operator, 1/s = integral,
  so G(s)=K/s means phase is the integral of voltage.

Co-Authored-By: Claude Opus 4.8 <noreply@anthropic.com>
</commit_message>
<xml_diff>
--- a/presentations/mid_term_202606/04_slides_draft/中間発表_制御則_検討用_v2.docx
+++ b/presentations/mid_term_202606/04_slides_draft/中間発表_制御則_検討用_v2.docx
@@ -768,7 +768,7 @@
           <w:b w:val="0"/>
           <w:sz w:val="21"/>
         </w:rPr>
-        <w:t>・制御電圧 u が OCXO-B の発振周波数を動かし、2台の周波数差 Δf が生じる。位相差 φ はその Δf の積分。</w:t>
+        <w:t>・制御電圧 u が OCXO-2 の発振周波数を動かし、2台の周波数差 Δf が生じる。位相差 φ はその Δf の積分。</w:t>
       </w:r>
     </w:p>
     <w:p>
@@ -821,7 +821,20 @@
           <w:b w:val="0"/>
           <w:sz w:val="21"/>
         </w:rPr>
-        <w:t>・したがって伝達関数は積分系（1/s）になる：</w:t>
+        <w:t>・「伝達関数」G(s) とは、システムの『入力→出力』の変換則を1つの式にしたもの（出力＝G(s)×入力）。s は微分・積分の演算子で、1/s＝積分・s＝微分。</w:t>
+      </w:r>
+    </w:p>
+    <w:p>
+      <w:pPr>
+        <w:spacing w:before="0" w:after="40"/>
+      </w:pPr>
+      <w:r>
+        <w:rPr>
+          <w:rFonts w:ascii="游ゴシック" w:hAnsi="游ゴシック" w:eastAsia="游ゴシック"/>
+          <w:b w:val="0"/>
+          <w:sz w:val="21"/>
+        </w:rPr>
+        <w:t>・本系は積分系 G(s)=K/s：電圧を入れると、その積分として位相が現れる（電圧→周波数→（積分）→位相）。</w:t>
       </w:r>
     </w:p>
     <w:p>

</xml_diff>